<commit_message>
quantize and deploy tts models
</commit_message>
<xml_diff>
--- a/docs/phase2_technical_proposal/phase2_technical_proposal.docx
+++ b/docs/phase2_technical_proposal/phase2_technical_proposal.docx
@@ -765,9 +765,9 @@
           <w:noProof/>
         </w:rPr>
         <mc:AlternateContent>
-          <mc:Choice Requires="wps">
+          <mc:Choice Requires="wpg">
             <w:drawing>
-              <wp:anchor distT="114300" distB="114300" distL="114300" distR="114300" simplePos="0" relativeHeight="251658240" behindDoc="1" locked="0" layoutInCell="1" hidden="0" allowOverlap="1" wp14:anchorId="11BD9E7A" wp14:editId="32757774">
+              <wp:anchor distT="114300" distB="114300" distL="114300" distR="114300" simplePos="0" relativeHeight="251658240" behindDoc="1" locked="0" layoutInCell="1" hidden="0" allowOverlap="1" wp14:anchorId="2DB7F0B1" wp14:editId="049970C0">
                 <wp:simplePos x="0" y="0"/>
                 <wp:positionH relativeFrom="column">
                   <wp:posOffset>-657224</wp:posOffset>
@@ -819,22 +819,47 @@
               </wp:anchor>
             </w:drawing>
           </mc:Choice>
-          <mc:Fallback>
-            <w:pict>
-              <v:rect w14:anchorId="11BD9E7A" id="Rectangle 1" o:spid="_x0000_s1026" style="position:absolute;margin-left:-51.75pt;margin-top:9pt;width:613.5pt;height:710.7pt;z-index:-251658240;visibility:visible;mso-wrap-style:square;mso-wrap-distance-left:9pt;mso-wrap-distance-top:9pt;mso-wrap-distance-right:9pt;mso-wrap-distance-bottom:9pt;mso-position-horizontal:absolute;mso-position-horizontal-relative:text;mso-position-vertical:absolute;mso-position-vertical-relative:text;v-text-anchor:middle" o:gfxdata="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" fillcolor="#f1f8ff" stroked="f">
-                <v:textbox inset="2.53958mm,2.53958mm,2.53958mm,2.53958mm">
-                  <w:txbxContent>
-                    <w:p>
-                      <w:pPr>
-                        <w:spacing w:after="0" w:line="240" w:lineRule="auto"/>
-                        <w:jc w:val="center"/>
-                        <w:textDirection w:val="btLr"/>
-                      </w:pPr>
-                    </w:p>
-                  </w:txbxContent>
-                </v:textbox>
-              </v:rect>
-            </w:pict>
+          <mc:Fallback xmlns:cr="http://schemas.microsoft.com/office/comments/2020/reactions" xmlns="http://schemas.microsoft.com/office/tasks/2019/documenttasks" xmlns:dgm="http://schemas.openxmlformats.org/drawingml/2006/diagram" xmlns:lc="http://schemas.openxmlformats.org/drawingml/2006/lockedCanvas" xmlns:c="http://schemas.openxmlformats.org/drawingml/2006/chart" xmlns:pic="http://schemas.openxmlformats.org/drawingml/2006/picture" xmlns:a="http://schemas.openxmlformats.org/drawingml/2006/main" xmlns:sl="http://schemas.openxmlformats.org/schemaLibrary/2006/main">
+            <w:drawing>
+              <wp:anchor allowOverlap="1" behindDoc="1" distB="114300" distT="114300" distL="114300" distR="114300" hidden="0" layoutInCell="1" locked="0" relativeHeight="0" simplePos="0">
+                <wp:simplePos x="0" y="0"/>
+                <wp:positionH relativeFrom="column">
+                  <wp:posOffset>-657224</wp:posOffset>
+                </wp:positionH>
+                <wp:positionV relativeFrom="paragraph">
+                  <wp:posOffset>114300</wp:posOffset>
+                </wp:positionV>
+                <wp:extent cx="7791450" cy="9026193"/>
+                <wp:effectExtent b="0" l="0" r="0" t="0"/>
+                <wp:wrapNone/>
+                <wp:docPr id="1" name="image5.png"/>
+                <a:graphic>
+                  <a:graphicData uri="http://schemas.openxmlformats.org/drawingml/2006/picture">
+                    <pic:pic>
+                      <pic:nvPicPr>
+                        <pic:cNvPr id="0" name="image5.png"/>
+                        <pic:cNvPicPr preferRelativeResize="0"/>
+                      </pic:nvPicPr>
+                      <pic:blipFill>
+                        <a:blip r:embed="rId7"/>
+                        <a:srcRect/>
+                        <a:stretch>
+                          <a:fillRect/>
+                        </a:stretch>
+                      </pic:blipFill>
+                      <pic:spPr>
+                        <a:xfrm>
+                          <a:off x="0" y="0"/>
+                          <a:ext cx="7791450" cy="9026193"/>
+                        </a:xfrm>
+                        <a:prstGeom prst="rect"/>
+                        <a:ln/>
+                      </pic:spPr>
+                    </pic:pic>
+                  </a:graphicData>
+                </a:graphic>
+              </wp:anchor>
+            </w:drawing>
           </mc:Fallback>
         </mc:AlternateContent>
       </w:r>
@@ -6080,20 +6105,20 @@
           <w:noProof/>
         </w:rPr>
         <w:drawing>
-          <wp:inline distT="114300" distB="114300" distL="114300" distR="114300" wp14:anchorId="5F745B68" wp14:editId="0DE37C73">
+          <wp:inline distT="114300" distB="114300" distL="114300" distR="114300" wp14:anchorId="0D871CF1" wp14:editId="136DFCF4">
             <wp:extent cx="6477000" cy="3441700"/>
             <wp:effectExtent l="0" t="0" r="0" b="0"/>
-            <wp:docPr id="5" name="image4.png"/>
+            <wp:docPr id="3" name="image2.png"/>
             <wp:cNvGraphicFramePr/>
             <a:graphic xmlns:a="http://schemas.openxmlformats.org/drawingml/2006/main">
               <a:graphicData uri="http://schemas.openxmlformats.org/drawingml/2006/picture">
                 <pic:pic xmlns:pic="http://schemas.openxmlformats.org/drawingml/2006/picture">
                   <pic:nvPicPr>
-                    <pic:cNvPr id="0" name="image4.png"/>
+                    <pic:cNvPr id="0" name="image2.png"/>
                     <pic:cNvPicPr preferRelativeResize="0"/>
                   </pic:nvPicPr>
                   <pic:blipFill>
-                    <a:blip r:embed="rId7"/>
+                    <a:blip r:embed="rId8"/>
                     <a:srcRect/>
                     <a:stretch>
                       <a:fillRect/>
@@ -6799,19 +6824,7 @@
               <w:rPr>
                 <w:rFonts w:ascii="Arial" w:eastAsia="Arial" w:hAnsi="Arial" w:cs="Arial"/>
               </w:rPr>
-              <w:t xml:space="preserve">ASR </w:t>
-            </w:r>
-            <w:r>
-              <w:rPr>
-                <w:rFonts w:ascii="Arial" w:eastAsia="Arial" w:hAnsi="Arial" w:cs="Arial"/>
-              </w:rPr>
-              <w:t>(</w:t>
-            </w:r>
-            <w:r>
-              <w:rPr>
-                <w:rFonts w:ascii="Arial" w:eastAsia="Arial" w:hAnsi="Arial" w:cs="Arial"/>
-              </w:rPr>
-              <w:t>Viet)</w:t>
+              <w:t>ASR (Viet)</w:t>
             </w:r>
           </w:p>
         </w:tc>
@@ -7303,31 +7316,7 @@
               <w:rPr>
                 <w:rFonts w:ascii="Arial" w:eastAsia="Arial" w:hAnsi="Arial" w:cs="Arial"/>
               </w:rPr>
-              <w:t>TTS</w:t>
-            </w:r>
-            <w:r>
-              <w:rPr>
-                <w:rFonts w:ascii="Arial" w:eastAsia="Arial" w:hAnsi="Arial" w:cs="Arial"/>
-              </w:rPr>
-              <w:t xml:space="preserve"> </w:t>
-            </w:r>
-            <w:r>
-              <w:rPr>
-                <w:rFonts w:ascii="Arial" w:eastAsia="Arial" w:hAnsi="Arial" w:cs="Arial"/>
-              </w:rPr>
-              <w:t>(</w:t>
-            </w:r>
-            <w:r>
-              <w:rPr>
-                <w:rFonts w:ascii="Arial" w:eastAsia="Arial" w:hAnsi="Arial" w:cs="Arial"/>
-              </w:rPr>
-              <w:t>Kor/Eng</w:t>
-            </w:r>
-            <w:r>
-              <w:rPr>
-                <w:rFonts w:ascii="Arial" w:eastAsia="Arial" w:hAnsi="Arial" w:cs="Arial"/>
-              </w:rPr>
-              <w:t>)</w:t>
+              <w:t>TTS (Kor/Eng)</w:t>
             </w:r>
           </w:p>
         </w:tc>
@@ -7492,31 +7481,7 @@
               <w:rPr>
                 <w:rFonts w:ascii="Arial" w:eastAsia="Arial" w:hAnsi="Arial" w:cs="Arial"/>
               </w:rPr>
-              <w:t>TTS</w:t>
-            </w:r>
-            <w:r>
-              <w:rPr>
-                <w:rFonts w:ascii="Arial" w:eastAsia="Arial" w:hAnsi="Arial" w:cs="Arial"/>
-              </w:rPr>
-              <w:t xml:space="preserve"> </w:t>
-            </w:r>
-            <w:r>
-              <w:rPr>
-                <w:rFonts w:ascii="Arial" w:eastAsia="Arial" w:hAnsi="Arial" w:cs="Arial"/>
-              </w:rPr>
-              <w:t>(</w:t>
-            </w:r>
-            <w:r>
-              <w:rPr>
-                <w:rFonts w:ascii="Arial" w:eastAsia="Arial" w:hAnsi="Arial" w:cs="Arial"/>
-              </w:rPr>
-              <w:t>Viet</w:t>
-            </w:r>
-            <w:r>
-              <w:rPr>
-                <w:rFonts w:ascii="Arial" w:eastAsia="Arial" w:hAnsi="Arial" w:cs="Arial"/>
-              </w:rPr>
-              <w:t>)</w:t>
+              <w:t>TTS (Viet)</w:t>
             </w:r>
           </w:p>
         </w:tc>
@@ -11290,20 +11255,20 @@
                 <w:szCs w:val="24"/>
               </w:rPr>
               <w:drawing>
-                <wp:inline distT="114300" distB="114300" distL="114300" distR="114300" wp14:anchorId="6B2A0F2F" wp14:editId="47955BE2">
+                <wp:inline distT="114300" distB="114300" distL="114300" distR="114300" wp14:anchorId="7D8DE757" wp14:editId="47F0F87B">
                   <wp:extent cx="6496050" cy="3800546"/>
                   <wp:effectExtent l="0" t="0" r="0" b="0"/>
-                  <wp:docPr id="2" name="image2.png"/>
+                  <wp:docPr id="4" name="image3.png"/>
                   <wp:cNvGraphicFramePr/>
                   <a:graphic xmlns:a="http://schemas.openxmlformats.org/drawingml/2006/main">
                     <a:graphicData uri="http://schemas.openxmlformats.org/drawingml/2006/picture">
                       <pic:pic xmlns:pic="http://schemas.openxmlformats.org/drawingml/2006/picture">
                         <pic:nvPicPr>
-                          <pic:cNvPr id="0" name="image2.png"/>
+                          <pic:cNvPr id="0" name="image3.png"/>
                           <pic:cNvPicPr preferRelativeResize="0"/>
                         </pic:nvPicPr>
                         <pic:blipFill>
-                          <a:blip r:embed="rId8"/>
+                          <a:blip r:embed="rId9"/>
                           <a:srcRect/>
                           <a:stretch>
                             <a:fillRect/>
@@ -12364,7 +12329,7 @@
               <w:rPr>
                 <w:rFonts w:ascii="Arial" w:eastAsia="Arial" w:hAnsi="Arial" w:cs="Arial"/>
               </w:rPr>
-              <w:t>Plan Overview, Project Manager, Model optimisation</w:t>
+              <w:t>Project Manager, Model Optimization</w:t>
             </w:r>
           </w:p>
         </w:tc>
@@ -12396,7 +12361,7 @@
               <w:rPr>
                 <w:rFonts w:ascii="Arial" w:eastAsia="Arial" w:hAnsi="Arial" w:cs="Arial"/>
               </w:rPr>
-              <w:t>Machine Translation Deployment + ASR deployment(Viet) + entire pipeline + Review whole implement</w:t>
+              <w:t>MT (NLLB) Deployment + End-to-End Pipeline Integration + System Review</w:t>
             </w:r>
           </w:p>
         </w:tc>
@@ -12494,7 +12459,7 @@
               <w:rPr>
                 <w:rFonts w:ascii="Arial" w:eastAsia="Arial" w:hAnsi="Arial" w:cs="Arial"/>
               </w:rPr>
-              <w:t>UI/UX, User Research</w:t>
+              <w:t>Speech AI, User Research</w:t>
             </w:r>
           </w:p>
         </w:tc>
@@ -12526,7 +12491,7 @@
               <w:rPr>
                 <w:rFonts w:ascii="Arial" w:eastAsia="Arial" w:hAnsi="Arial" w:cs="Arial"/>
               </w:rPr>
-              <w:t>ASR deployment (Chin + Kor + Eng) + Problem Statement + Target Users</w:t>
+              <w:t>ASR (Zipformer, SenseVoice) Deployment + Problem Formulation &amp; User Persona Analysis</w:t>
             </w:r>
           </w:p>
         </w:tc>
@@ -12560,7 +12525,7 @@
               <w:rPr>
                 <w:rFonts w:ascii="Arial" w:eastAsia="Arial" w:hAnsi="Arial" w:cs="Arial"/>
               </w:rPr>
-              <w:t>Pham Chan Khoa</w:t>
+              <w:t>Tran Trung Hieu</w:t>
             </w:r>
           </w:p>
         </w:tc>
@@ -12624,7 +12589,7 @@
               <w:rPr>
                 <w:rFonts w:ascii="Arial" w:eastAsia="Arial" w:hAnsi="Arial" w:cs="Arial"/>
               </w:rPr>
-              <w:t>Business Analyst, Model Quantization</w:t>
+              <w:t>Edge AI Optimization, System Architecture</w:t>
             </w:r>
           </w:p>
         </w:tc>
@@ -12656,7 +12621,7 @@
               <w:rPr>
                 <w:rFonts w:ascii="Arial" w:eastAsia="Arial" w:hAnsi="Arial" w:cs="Arial"/>
               </w:rPr>
-              <w:t>TTS deployment (Kor + Eng) + Data Collecting + Business Solution</w:t>
+              <w:t>TTS (MeloTTS) Deployment + NPU Hardware Quantization + System Architecture Design</w:t>
             </w:r>
           </w:p>
         </w:tc>
@@ -12690,7 +12655,7 @@
               <w:rPr>
                 <w:rFonts w:ascii="Arial" w:eastAsia="Arial" w:hAnsi="Arial" w:cs="Arial"/>
               </w:rPr>
-              <w:t>Cai Hoang Bao Kin</w:t>
+              <w:t>Pham Chan Khoa</w:t>
             </w:r>
           </w:p>
         </w:tc>
@@ -12754,7 +12719,7 @@
               <w:rPr>
                 <w:rFonts w:ascii="Arial" w:eastAsia="Arial" w:hAnsi="Arial" w:cs="Arial"/>
               </w:rPr>
-              <w:t xml:space="preserve">Natural Language Processing, Machine Translation, Model Evaluation </w:t>
+              <w:t xml:space="preserve">Business Analyst, Voice AI </w:t>
             </w:r>
           </w:p>
         </w:tc>
@@ -12786,7 +12751,7 @@
               <w:rPr>
                 <w:rFonts w:ascii="Arial" w:eastAsia="Arial" w:hAnsi="Arial" w:cs="Arial"/>
               </w:rPr>
-              <w:t xml:space="preserve">Machine Translation Selection &amp; Evaluation + MT Streaming Policy + AI Approach Design </w:t>
+              <w:t>TTS (Supertonic) Deployment + Data Acquisition + Business Solution Strategy</w:t>
             </w:r>
           </w:p>
         </w:tc>
@@ -12820,7 +12785,7 @@
               <w:rPr>
                 <w:rFonts w:ascii="Arial" w:eastAsia="Arial" w:hAnsi="Arial" w:cs="Arial"/>
               </w:rPr>
-              <w:t>Tran Trung Hieu</w:t>
+              <w:t>Cai Hoang Bao Kin</w:t>
             </w:r>
           </w:p>
         </w:tc>
@@ -12884,7 +12849,7 @@
               <w:rPr>
                 <w:rFonts w:ascii="Arial" w:eastAsia="Arial" w:hAnsi="Arial" w:cs="Arial"/>
               </w:rPr>
-              <w:t>Edge AI Optimization, Hardware Deployment, System Architecture</w:t>
+              <w:t>NLP, AI Architecture</w:t>
             </w:r>
           </w:p>
         </w:tc>
@@ -12916,7 +12881,7 @@
               <w:rPr>
                 <w:rFonts w:ascii="Arial" w:eastAsia="Arial" w:hAnsi="Arial" w:cs="Arial"/>
               </w:rPr>
-              <w:t>TTS Deployment (Chin) + Hardware Quantization + Architecture Design</w:t>
+              <w:t>TTS (Piper) Deployment + Model Benchmarking &amp; Evaluation + Streaming Policy Design + AI Architecture Design</w:t>
             </w:r>
           </w:p>
         </w:tc>
@@ -13229,14 +13194,14 @@
               <w:rPr>
                 <w:rFonts w:ascii="Arial" w:eastAsia="Arial" w:hAnsi="Arial" w:cs="Arial"/>
               </w:rPr>
-              <w:t xml:space="preserve">Validated the language-barrier problem on Vietnamese FDI factory floors; evaluated compute platforms (Rubik Pi 3 / QCS6490 vs. Dragonwing IQ-9075 EVK) and confirmed QCS6490's Hexagon NPU generation cannot compile the required w8a16 recipe; surveyed ASR/MT/TTS model candidates (Zipformer, SenseVoice-Small, NLLB-200, </w:t>
+              <w:t>Validated the language-barrier problem on Vietnamese FDI factory floors; evaluated compute platforms (Rubik Pi 3 / QCS6490 vs. Dragonwing IQ-9075 EVK) and confirmed QCS6490's Hexagon NPU generation cannot compile the required w8a16 recipe; surveyed ASR/MT/TTS model candidates (Zipformer, SenseVoice-</w:t>
             </w:r>
             <w:r>
               <w:rPr>
                 <w:rFonts w:ascii="Arial" w:eastAsia="Arial" w:hAnsi="Arial" w:cs="Arial"/>
               </w:rPr>
               <w:lastRenderedPageBreak/>
-              <w:t xml:space="preserve">Supertonic, Piper, MeloTTS). </w:t>
+              <w:t xml:space="preserve">Small, NLLB-200, Supertonic, Piper, MeloTTS). </w:t>
             </w:r>
           </w:p>
         </w:tc>
@@ -13665,22 +13630,6 @@
         </w:tc>
       </w:tr>
     </w:tbl>
-    <w:p>
-      <w:pPr>
-        <w:pBdr>
-          <w:bottom w:val="single" w:sz="6" w:space="1" w:color="00B4D8"/>
-        </w:pBdr>
-        <w:spacing w:after="0"/>
-        <w:rPr>
-          <w:rFonts w:ascii="Arial" w:eastAsia="Arial" w:hAnsi="Arial" w:cs="Arial"/>
-          <w:b/>
-          <w:bCs/>
-          <w:color w:val="0A2357"/>
-          <w:sz w:val="28"/>
-          <w:szCs w:val="28"/>
-        </w:rPr>
-      </w:pPr>
-    </w:p>
     <w:p>
       <w:pPr>
         <w:pBdr>
@@ -14933,10 +14882,10 @@
       </w:pPr>
     </w:p>
     <w:sectPr>
-      <w:headerReference w:type="default" r:id="rId9"/>
-      <w:footerReference w:type="default" r:id="rId10"/>
-      <w:headerReference w:type="first" r:id="rId11"/>
-      <w:footerReference w:type="first" r:id="rId12"/>
+      <w:headerReference w:type="default" r:id="rId10"/>
+      <w:footerReference w:type="default" r:id="rId11"/>
+      <w:headerReference w:type="first" r:id="rId12"/>
+      <w:footerReference w:type="first" r:id="rId13"/>
       <w:pgSz w:w="12240" w:h="15840"/>
       <w:pgMar w:top="1134" w:right="1020" w:bottom="1134" w:left="1020" w:header="720" w:footer="720" w:gutter="0"/>
       <w:pgNumType w:start="1"/>
@@ -15202,7 +15151,7 @@
         <w:noProof/>
       </w:rPr>
       <w:drawing>
-        <wp:anchor distT="114300" distB="114300" distL="114300" distR="114300" simplePos="0" relativeHeight="251658240" behindDoc="0" locked="0" layoutInCell="1" hidden="0" allowOverlap="1" wp14:anchorId="50052EC8" wp14:editId="71E08AD1">
+        <wp:anchor distT="114300" distB="114300" distL="114300" distR="114300" simplePos="0" relativeHeight="251658240" behindDoc="0" locked="0" layoutInCell="1" hidden="0" allowOverlap="1" wp14:anchorId="0A791315" wp14:editId="61DDB9A9">
           <wp:simplePos x="0" y="0"/>
           <wp:positionH relativeFrom="column">
             <wp:posOffset>19051</wp:posOffset>
@@ -15213,13 +15162,13 @@
           <wp:extent cx="1207974" cy="319088"/>
           <wp:effectExtent l="0" t="0" r="0" b="0"/>
           <wp:wrapNone/>
-          <wp:docPr id="3" name="image1.png"/>
+          <wp:docPr id="5" name="image4.png"/>
           <wp:cNvGraphicFramePr/>
           <a:graphic xmlns:a="http://schemas.openxmlformats.org/drawingml/2006/main">
             <a:graphicData uri="http://schemas.openxmlformats.org/drawingml/2006/picture">
               <pic:pic xmlns:pic="http://schemas.openxmlformats.org/drawingml/2006/picture">
                 <pic:nvPicPr>
-                  <pic:cNvPr id="0" name="image1.png"/>
+                  <pic:cNvPr id="0" name="image4.png"/>
                   <pic:cNvPicPr preferRelativeResize="0"/>
                 </pic:nvPicPr>
                 <pic:blipFill>
@@ -15267,7 +15216,7 @@
         <w:noProof/>
       </w:rPr>
       <w:drawing>
-        <wp:anchor distT="114300" distB="114300" distL="114300" distR="114300" simplePos="0" relativeHeight="251659264" behindDoc="0" locked="0" layoutInCell="1" hidden="0" allowOverlap="1" wp14:anchorId="4E3A5DCD" wp14:editId="302D4E47">
+        <wp:anchor distT="114300" distB="114300" distL="114300" distR="114300" simplePos="0" relativeHeight="251659264" behindDoc="0" locked="0" layoutInCell="1" hidden="0" allowOverlap="1" wp14:anchorId="1228689B" wp14:editId="3341BE7A">
           <wp:simplePos x="0" y="0"/>
           <wp:positionH relativeFrom="column">
             <wp:posOffset>-647699</wp:posOffset>
@@ -15278,13 +15227,13 @@
           <wp:extent cx="7772158" cy="1871663"/>
           <wp:effectExtent l="0" t="0" r="0" b="0"/>
           <wp:wrapNone/>
-          <wp:docPr id="4" name="image5.png"/>
+          <wp:docPr id="2" name="image1.png"/>
           <wp:cNvGraphicFramePr/>
           <a:graphic xmlns:a="http://schemas.openxmlformats.org/drawingml/2006/main">
             <a:graphicData uri="http://schemas.openxmlformats.org/drawingml/2006/picture">
               <pic:pic xmlns:pic="http://schemas.openxmlformats.org/drawingml/2006/picture">
                 <pic:nvPicPr>
-                  <pic:cNvPr id="0" name="image5.png"/>
+                  <pic:cNvPr id="0" name="image1.png"/>
                   <pic:cNvPicPr preferRelativeResize="0"/>
                 </pic:nvPicPr>
                 <pic:blipFill>
@@ -15317,574 +15266,9 @@
 <file path=word/numbering.xml><?xml version="1.0" encoding="utf-8"?>
 <w:numbering xmlns:wpc="http://schemas.microsoft.com/office/word/2010/wordprocessingCanvas" xmlns:cx="http://schemas.microsoft.com/office/drawing/2014/chartex" xmlns:cx1="http://schemas.microsoft.com/office/drawing/2015/9/8/chartex" xmlns:cx2="http://schemas.microsoft.com/office/drawing/2015/10/21/chartex" xmlns:cx3="http://schemas.microsoft.com/office/drawing/2016/5/9/chartex" xmlns:cx4="http://schemas.microsoft.com/office/drawing/2016/5/10/chartex" xmlns:cx5="http://schemas.microsoft.com/office/drawing/2016/5/11/chartex" xmlns:cx6="http://schemas.microsoft.com/office/drawing/2016/5/12/chartex" xmlns:cx7="http://schemas.microsoft.com/office/drawing/2016/5/13/chartex" xmlns:cx8="http://schemas.microsoft.com/office/drawing/2016/5/14/chartex" xmlns:mc="http://schemas.openxmlformats.org/markup-compatibility/2006" xmlns:aink="http://schemas.microsoft.com/office/drawing/2016/ink" xmlns:am3d="http://schemas.microsoft.com/office/drawing/2017/model3d" xmlns:o="urn:schemas-microsoft-com:office:office" xmlns:oel="http://schemas.microsoft.com/office/2019/extlst" xmlns:r="http://schemas.openxmlformats.org/officeDocument/2006/relationships" xmlns:m="http://schemas.openxmlformats.org/officeDocument/2006/math" xmlns:v="urn:schemas-microsoft-com:vml" xmlns:wp14="http://schemas.microsoft.com/office/word/2010/wordprocessingDrawing" xmlns:wp="http://schemas.openxmlformats.org/drawingml/2006/wordprocessingDrawing" xmlns:w10="urn:schemas-microsoft-com:office:word" xmlns:w="http://schemas.openxmlformats.org/wordprocessingml/2006/main" xmlns:w14="http://schemas.microsoft.com/office/word/2010/wordml" xmlns:w15="http://schemas.microsoft.com/office/word/2012/wordml" xmlns:w16cex="http://schemas.microsoft.com/office/word/2018/wordml/cex" xmlns:w16cid="http://schemas.microsoft.com/office/word/2016/wordml/cid" xmlns:w16="http://schemas.microsoft.com/office/word/2018/wordml" xmlns:w16du="http://schemas.microsoft.com/office/word/2023/wordml/word16du" xmlns:w16sdtdh="http://schemas.microsoft.com/office/word/2020/wordml/sdtdatahash" xmlns:w16sdtfl="http://schemas.microsoft.com/office/word/2024/wordml/sdtformatlock" xmlns:w16se="http://schemas.microsoft.com/office/word/2015/wordml/symex" xmlns:wpg="http://schemas.microsoft.com/office/word/2010/wordprocessingGroup" xmlns:wpi="http://schemas.microsoft.com/office/word/2010/wordprocessingInk" xmlns:wne="http://schemas.microsoft.com/office/word/2006/wordml" xmlns:wps="http://schemas.microsoft.com/office/word/2010/wordprocessingShape" mc:Ignorable="w14 w15 w16se w16cid w16 w16cex w16sdtdh w16sdtfl w16du wp14">
   <w:abstractNum w:abstractNumId="0" w15:restartNumberingAfterBreak="0">
-    <w:nsid w:val="1EDE61F7"/>
+    <w:nsid w:val="01467D50"/>
     <w:multiLevelType w:val="multilevel"/>
-    <w:tmpl w:val="2BE09224"/>
-    <w:lvl w:ilvl="0">
-      <w:start w:val="1"/>
-      <w:numFmt w:val="bullet"/>
-      <w:lvlText w:val="●"/>
-      <w:lvlJc w:val="left"/>
-      <w:pPr>
-        <w:ind w:left="720" w:hanging="360"/>
-      </w:pPr>
-      <w:rPr>
-        <w:u w:val="none"/>
-      </w:rPr>
-    </w:lvl>
-    <w:lvl w:ilvl="1">
-      <w:start w:val="1"/>
-      <w:numFmt w:val="bullet"/>
-      <w:lvlText w:val="○"/>
-      <w:lvlJc w:val="left"/>
-      <w:pPr>
-        <w:ind w:left="1440" w:hanging="360"/>
-      </w:pPr>
-      <w:rPr>
-        <w:u w:val="none"/>
-      </w:rPr>
-    </w:lvl>
-    <w:lvl w:ilvl="2">
-      <w:start w:val="1"/>
-      <w:numFmt w:val="bullet"/>
-      <w:lvlText w:val="■"/>
-      <w:lvlJc w:val="left"/>
-      <w:pPr>
-        <w:ind w:left="2160" w:hanging="360"/>
-      </w:pPr>
-      <w:rPr>
-        <w:u w:val="none"/>
-      </w:rPr>
-    </w:lvl>
-    <w:lvl w:ilvl="3">
-      <w:start w:val="1"/>
-      <w:numFmt w:val="bullet"/>
-      <w:lvlText w:val="●"/>
-      <w:lvlJc w:val="left"/>
-      <w:pPr>
-        <w:ind w:left="2880" w:hanging="360"/>
-      </w:pPr>
-      <w:rPr>
-        <w:u w:val="none"/>
-      </w:rPr>
-    </w:lvl>
-    <w:lvl w:ilvl="4">
-      <w:start w:val="1"/>
-      <w:numFmt w:val="bullet"/>
-      <w:lvlText w:val="○"/>
-      <w:lvlJc w:val="left"/>
-      <w:pPr>
-        <w:ind w:left="3600" w:hanging="360"/>
-      </w:pPr>
-      <w:rPr>
-        <w:u w:val="none"/>
-      </w:rPr>
-    </w:lvl>
-    <w:lvl w:ilvl="5">
-      <w:start w:val="1"/>
-      <w:numFmt w:val="bullet"/>
-      <w:lvlText w:val="■"/>
-      <w:lvlJc w:val="left"/>
-      <w:pPr>
-        <w:ind w:left="4320" w:hanging="360"/>
-      </w:pPr>
-      <w:rPr>
-        <w:u w:val="none"/>
-      </w:rPr>
-    </w:lvl>
-    <w:lvl w:ilvl="6">
-      <w:start w:val="1"/>
-      <w:numFmt w:val="bullet"/>
-      <w:lvlText w:val="●"/>
-      <w:lvlJc w:val="left"/>
-      <w:pPr>
-        <w:ind w:left="5040" w:hanging="360"/>
-      </w:pPr>
-      <w:rPr>
-        <w:u w:val="none"/>
-      </w:rPr>
-    </w:lvl>
-    <w:lvl w:ilvl="7">
-      <w:start w:val="1"/>
-      <w:numFmt w:val="bullet"/>
-      <w:lvlText w:val="○"/>
-      <w:lvlJc w:val="left"/>
-      <w:pPr>
-        <w:ind w:left="5760" w:hanging="360"/>
-      </w:pPr>
-      <w:rPr>
-        <w:u w:val="none"/>
-      </w:rPr>
-    </w:lvl>
-    <w:lvl w:ilvl="8">
-      <w:start w:val="1"/>
-      <w:numFmt w:val="bullet"/>
-      <w:lvlText w:val="■"/>
-      <w:lvlJc w:val="left"/>
-      <w:pPr>
-        <w:ind w:left="6480" w:hanging="360"/>
-      </w:pPr>
-      <w:rPr>
-        <w:u w:val="none"/>
-      </w:rPr>
-    </w:lvl>
-  </w:abstractNum>
-  <w:abstractNum w:abstractNumId="1" w15:restartNumberingAfterBreak="0">
-    <w:nsid w:val="2B800B36"/>
-    <w:multiLevelType w:val="multilevel"/>
-    <w:tmpl w:val="94980DE8"/>
-    <w:lvl w:ilvl="0">
-      <w:start w:val="1"/>
-      <w:numFmt w:val="decimal"/>
-      <w:lvlText w:val="%1."/>
-      <w:lvlJc w:val="left"/>
-      <w:pPr>
-        <w:ind w:left="720" w:hanging="360"/>
-      </w:pPr>
-      <w:rPr>
-        <w:u w:val="none"/>
-      </w:rPr>
-    </w:lvl>
-    <w:lvl w:ilvl="1">
-      <w:start w:val="1"/>
-      <w:numFmt w:val="lowerLetter"/>
-      <w:lvlText w:val="%2."/>
-      <w:lvlJc w:val="left"/>
-      <w:pPr>
-        <w:ind w:left="1440" w:hanging="360"/>
-      </w:pPr>
-      <w:rPr>
-        <w:u w:val="none"/>
-      </w:rPr>
-    </w:lvl>
-    <w:lvl w:ilvl="2">
-      <w:start w:val="1"/>
-      <w:numFmt w:val="lowerRoman"/>
-      <w:lvlText w:val="%3."/>
-      <w:lvlJc w:val="right"/>
-      <w:pPr>
-        <w:ind w:left="2160" w:hanging="360"/>
-      </w:pPr>
-      <w:rPr>
-        <w:u w:val="none"/>
-      </w:rPr>
-    </w:lvl>
-    <w:lvl w:ilvl="3">
-      <w:start w:val="1"/>
-      <w:numFmt w:val="decimal"/>
-      <w:lvlText w:val="%4."/>
-      <w:lvlJc w:val="left"/>
-      <w:pPr>
-        <w:ind w:left="2880" w:hanging="360"/>
-      </w:pPr>
-      <w:rPr>
-        <w:u w:val="none"/>
-      </w:rPr>
-    </w:lvl>
-    <w:lvl w:ilvl="4">
-      <w:start w:val="1"/>
-      <w:numFmt w:val="lowerLetter"/>
-      <w:lvlText w:val="%5."/>
-      <w:lvlJc w:val="left"/>
-      <w:pPr>
-        <w:ind w:left="3600" w:hanging="360"/>
-      </w:pPr>
-      <w:rPr>
-        <w:u w:val="none"/>
-      </w:rPr>
-    </w:lvl>
-    <w:lvl w:ilvl="5">
-      <w:start w:val="1"/>
-      <w:numFmt w:val="lowerRoman"/>
-      <w:lvlText w:val="%6."/>
-      <w:lvlJc w:val="right"/>
-      <w:pPr>
-        <w:ind w:left="4320" w:hanging="360"/>
-      </w:pPr>
-      <w:rPr>
-        <w:u w:val="none"/>
-      </w:rPr>
-    </w:lvl>
-    <w:lvl w:ilvl="6">
-      <w:start w:val="1"/>
-      <w:numFmt w:val="decimal"/>
-      <w:lvlText w:val="%7."/>
-      <w:lvlJc w:val="left"/>
-      <w:pPr>
-        <w:ind w:left="5040" w:hanging="360"/>
-      </w:pPr>
-      <w:rPr>
-        <w:u w:val="none"/>
-      </w:rPr>
-    </w:lvl>
-    <w:lvl w:ilvl="7">
-      <w:start w:val="1"/>
-      <w:numFmt w:val="lowerLetter"/>
-      <w:lvlText w:val="%8."/>
-      <w:lvlJc w:val="left"/>
-      <w:pPr>
-        <w:ind w:left="5760" w:hanging="360"/>
-      </w:pPr>
-      <w:rPr>
-        <w:u w:val="none"/>
-      </w:rPr>
-    </w:lvl>
-    <w:lvl w:ilvl="8">
-      <w:start w:val="1"/>
-      <w:numFmt w:val="lowerRoman"/>
-      <w:lvlText w:val="%9."/>
-      <w:lvlJc w:val="right"/>
-      <w:pPr>
-        <w:ind w:left="6480" w:hanging="360"/>
-      </w:pPr>
-      <w:rPr>
-        <w:u w:val="none"/>
-      </w:rPr>
-    </w:lvl>
-  </w:abstractNum>
-  <w:abstractNum w:abstractNumId="2" w15:restartNumberingAfterBreak="0">
-    <w:nsid w:val="2E1F2284"/>
-    <w:multiLevelType w:val="multilevel"/>
-    <w:tmpl w:val="9D36D024"/>
-    <w:lvl w:ilvl="0">
-      <w:start w:val="1"/>
-      <w:numFmt w:val="bullet"/>
-      <w:lvlText w:val="●"/>
-      <w:lvlJc w:val="left"/>
-      <w:pPr>
-        <w:ind w:left="720" w:hanging="360"/>
-      </w:pPr>
-      <w:rPr>
-        <w:u w:val="none"/>
-      </w:rPr>
-    </w:lvl>
-    <w:lvl w:ilvl="1">
-      <w:start w:val="1"/>
-      <w:numFmt w:val="bullet"/>
-      <w:lvlText w:val="○"/>
-      <w:lvlJc w:val="left"/>
-      <w:pPr>
-        <w:ind w:left="1440" w:hanging="360"/>
-      </w:pPr>
-      <w:rPr>
-        <w:u w:val="none"/>
-      </w:rPr>
-    </w:lvl>
-    <w:lvl w:ilvl="2">
-      <w:start w:val="1"/>
-      <w:numFmt w:val="bullet"/>
-      <w:lvlText w:val="■"/>
-      <w:lvlJc w:val="left"/>
-      <w:pPr>
-        <w:ind w:left="2160" w:hanging="360"/>
-      </w:pPr>
-      <w:rPr>
-        <w:u w:val="none"/>
-      </w:rPr>
-    </w:lvl>
-    <w:lvl w:ilvl="3">
-      <w:start w:val="1"/>
-      <w:numFmt w:val="bullet"/>
-      <w:lvlText w:val="●"/>
-      <w:lvlJc w:val="left"/>
-      <w:pPr>
-        <w:ind w:left="2880" w:hanging="360"/>
-      </w:pPr>
-      <w:rPr>
-        <w:u w:val="none"/>
-      </w:rPr>
-    </w:lvl>
-    <w:lvl w:ilvl="4">
-      <w:start w:val="1"/>
-      <w:numFmt w:val="bullet"/>
-      <w:lvlText w:val="○"/>
-      <w:lvlJc w:val="left"/>
-      <w:pPr>
-        <w:ind w:left="3600" w:hanging="360"/>
-      </w:pPr>
-      <w:rPr>
-        <w:u w:val="none"/>
-      </w:rPr>
-    </w:lvl>
-    <w:lvl w:ilvl="5">
-      <w:start w:val="1"/>
-      <w:numFmt w:val="bullet"/>
-      <w:lvlText w:val="■"/>
-      <w:lvlJc w:val="left"/>
-      <w:pPr>
-        <w:ind w:left="4320" w:hanging="360"/>
-      </w:pPr>
-      <w:rPr>
-        <w:u w:val="none"/>
-      </w:rPr>
-    </w:lvl>
-    <w:lvl w:ilvl="6">
-      <w:start w:val="1"/>
-      <w:numFmt w:val="bullet"/>
-      <w:lvlText w:val="●"/>
-      <w:lvlJc w:val="left"/>
-      <w:pPr>
-        <w:ind w:left="5040" w:hanging="360"/>
-      </w:pPr>
-      <w:rPr>
-        <w:u w:val="none"/>
-      </w:rPr>
-    </w:lvl>
-    <w:lvl w:ilvl="7">
-      <w:start w:val="1"/>
-      <w:numFmt w:val="bullet"/>
-      <w:lvlText w:val="○"/>
-      <w:lvlJc w:val="left"/>
-      <w:pPr>
-        <w:ind w:left="5760" w:hanging="360"/>
-      </w:pPr>
-      <w:rPr>
-        <w:u w:val="none"/>
-      </w:rPr>
-    </w:lvl>
-    <w:lvl w:ilvl="8">
-      <w:start w:val="1"/>
-      <w:numFmt w:val="bullet"/>
-      <w:lvlText w:val="■"/>
-      <w:lvlJc w:val="left"/>
-      <w:pPr>
-        <w:ind w:left="6480" w:hanging="360"/>
-      </w:pPr>
-      <w:rPr>
-        <w:u w:val="none"/>
-      </w:rPr>
-    </w:lvl>
-  </w:abstractNum>
-  <w:abstractNum w:abstractNumId="3" w15:restartNumberingAfterBreak="0">
-    <w:nsid w:val="38E72D9A"/>
-    <w:multiLevelType w:val="multilevel"/>
-    <w:tmpl w:val="6A328F7A"/>
-    <w:lvl w:ilvl="0">
-      <w:start w:val="1"/>
-      <w:numFmt w:val="bullet"/>
-      <w:lvlText w:val="●"/>
-      <w:lvlJc w:val="left"/>
-      <w:pPr>
-        <w:ind w:left="720" w:hanging="360"/>
-      </w:pPr>
-      <w:rPr>
-        <w:u w:val="none"/>
-      </w:rPr>
-    </w:lvl>
-    <w:lvl w:ilvl="1">
-      <w:start w:val="1"/>
-      <w:numFmt w:val="bullet"/>
-      <w:lvlText w:val="○"/>
-      <w:lvlJc w:val="left"/>
-      <w:pPr>
-        <w:ind w:left="1440" w:hanging="360"/>
-      </w:pPr>
-      <w:rPr>
-        <w:u w:val="none"/>
-      </w:rPr>
-    </w:lvl>
-    <w:lvl w:ilvl="2">
-      <w:start w:val="1"/>
-      <w:numFmt w:val="bullet"/>
-      <w:lvlText w:val="■"/>
-      <w:lvlJc w:val="left"/>
-      <w:pPr>
-        <w:ind w:left="2160" w:hanging="360"/>
-      </w:pPr>
-      <w:rPr>
-        <w:u w:val="none"/>
-      </w:rPr>
-    </w:lvl>
-    <w:lvl w:ilvl="3">
-      <w:start w:val="1"/>
-      <w:numFmt w:val="bullet"/>
-      <w:lvlText w:val="●"/>
-      <w:lvlJc w:val="left"/>
-      <w:pPr>
-        <w:ind w:left="2880" w:hanging="360"/>
-      </w:pPr>
-      <w:rPr>
-        <w:u w:val="none"/>
-      </w:rPr>
-    </w:lvl>
-    <w:lvl w:ilvl="4">
-      <w:start w:val="1"/>
-      <w:numFmt w:val="bullet"/>
-      <w:lvlText w:val="○"/>
-      <w:lvlJc w:val="left"/>
-      <w:pPr>
-        <w:ind w:left="3600" w:hanging="360"/>
-      </w:pPr>
-      <w:rPr>
-        <w:u w:val="none"/>
-      </w:rPr>
-    </w:lvl>
-    <w:lvl w:ilvl="5">
-      <w:start w:val="1"/>
-      <w:numFmt w:val="bullet"/>
-      <w:lvlText w:val="■"/>
-      <w:lvlJc w:val="left"/>
-      <w:pPr>
-        <w:ind w:left="4320" w:hanging="360"/>
-      </w:pPr>
-      <w:rPr>
-        <w:u w:val="none"/>
-      </w:rPr>
-    </w:lvl>
-    <w:lvl w:ilvl="6">
-      <w:start w:val="1"/>
-      <w:numFmt w:val="bullet"/>
-      <w:lvlText w:val="●"/>
-      <w:lvlJc w:val="left"/>
-      <w:pPr>
-        <w:ind w:left="5040" w:hanging="360"/>
-      </w:pPr>
-      <w:rPr>
-        <w:u w:val="none"/>
-      </w:rPr>
-    </w:lvl>
-    <w:lvl w:ilvl="7">
-      <w:start w:val="1"/>
-      <w:numFmt w:val="bullet"/>
-      <w:lvlText w:val="○"/>
-      <w:lvlJc w:val="left"/>
-      <w:pPr>
-        <w:ind w:left="5760" w:hanging="360"/>
-      </w:pPr>
-      <w:rPr>
-        <w:u w:val="none"/>
-      </w:rPr>
-    </w:lvl>
-    <w:lvl w:ilvl="8">
-      <w:start w:val="1"/>
-      <w:numFmt w:val="bullet"/>
-      <w:lvlText w:val="■"/>
-      <w:lvlJc w:val="left"/>
-      <w:pPr>
-        <w:ind w:left="6480" w:hanging="360"/>
-      </w:pPr>
-      <w:rPr>
-        <w:u w:val="none"/>
-      </w:rPr>
-    </w:lvl>
-  </w:abstractNum>
-  <w:abstractNum w:abstractNumId="4" w15:restartNumberingAfterBreak="0">
-    <w:nsid w:val="5F063861"/>
-    <w:multiLevelType w:val="multilevel"/>
-    <w:tmpl w:val="5B6EEF36"/>
-    <w:lvl w:ilvl="0">
-      <w:start w:val="1"/>
-      <w:numFmt w:val="bullet"/>
-      <w:lvlText w:val="●"/>
-      <w:lvlJc w:val="left"/>
-      <w:pPr>
-        <w:ind w:left="720" w:hanging="360"/>
-      </w:pPr>
-      <w:rPr>
-        <w:u w:val="none"/>
-      </w:rPr>
-    </w:lvl>
-    <w:lvl w:ilvl="1">
-      <w:start w:val="1"/>
-      <w:numFmt w:val="bullet"/>
-      <w:lvlText w:val="●"/>
-      <w:lvlJc w:val="left"/>
-      <w:pPr>
-        <w:ind w:left="1440" w:hanging="360"/>
-      </w:pPr>
-      <w:rPr>
-        <w:u w:val="none"/>
-      </w:rPr>
-    </w:lvl>
-    <w:lvl w:ilvl="2">
-      <w:start w:val="1"/>
-      <w:numFmt w:val="bullet"/>
-      <w:lvlText w:val="■"/>
-      <w:lvlJc w:val="left"/>
-      <w:pPr>
-        <w:ind w:left="2160" w:hanging="360"/>
-      </w:pPr>
-      <w:rPr>
-        <w:u w:val="none"/>
-      </w:rPr>
-    </w:lvl>
-    <w:lvl w:ilvl="3">
-      <w:start w:val="1"/>
-      <w:numFmt w:val="bullet"/>
-      <w:lvlText w:val="●"/>
-      <w:lvlJc w:val="left"/>
-      <w:pPr>
-        <w:ind w:left="2880" w:hanging="360"/>
-      </w:pPr>
-      <w:rPr>
-        <w:u w:val="none"/>
-      </w:rPr>
-    </w:lvl>
-    <w:lvl w:ilvl="4">
-      <w:start w:val="1"/>
-      <w:numFmt w:val="bullet"/>
-      <w:lvlText w:val="○"/>
-      <w:lvlJc w:val="left"/>
-      <w:pPr>
-        <w:ind w:left="3600" w:hanging="360"/>
-      </w:pPr>
-      <w:rPr>
-        <w:u w:val="none"/>
-      </w:rPr>
-    </w:lvl>
-    <w:lvl w:ilvl="5">
-      <w:start w:val="1"/>
-      <w:numFmt w:val="bullet"/>
-      <w:lvlText w:val="■"/>
-      <w:lvlJc w:val="left"/>
-      <w:pPr>
-        <w:ind w:left="4320" w:hanging="360"/>
-      </w:pPr>
-      <w:rPr>
-        <w:u w:val="none"/>
-      </w:rPr>
-    </w:lvl>
-    <w:lvl w:ilvl="6">
-      <w:start w:val="1"/>
-      <w:numFmt w:val="bullet"/>
-      <w:lvlText w:val="●"/>
-      <w:lvlJc w:val="left"/>
-      <w:pPr>
-        <w:ind w:left="5040" w:hanging="360"/>
-      </w:pPr>
-      <w:rPr>
-        <w:u w:val="none"/>
-      </w:rPr>
-    </w:lvl>
-    <w:lvl w:ilvl="7">
-      <w:start w:val="1"/>
-      <w:numFmt w:val="bullet"/>
-      <w:lvlText w:val="○"/>
-      <w:lvlJc w:val="left"/>
-      <w:pPr>
-        <w:ind w:left="5760" w:hanging="360"/>
-      </w:pPr>
-      <w:rPr>
-        <w:u w:val="none"/>
-      </w:rPr>
-    </w:lvl>
-    <w:lvl w:ilvl="8">
-      <w:start w:val="1"/>
-      <w:numFmt w:val="bullet"/>
-      <w:lvlText w:val="■"/>
-      <w:lvlJc w:val="left"/>
-      <w:pPr>
-        <w:ind w:left="6480" w:hanging="360"/>
-      </w:pPr>
-      <w:rPr>
-        <w:u w:val="none"/>
-      </w:rPr>
-    </w:lvl>
-  </w:abstractNum>
-  <w:abstractNum w:abstractNumId="5" w15:restartNumberingAfterBreak="0">
-    <w:nsid w:val="67F90295"/>
-    <w:multiLevelType w:val="multilevel"/>
-    <w:tmpl w:val="9C1ED7C8"/>
+    <w:tmpl w:val="C66C9A60"/>
     <w:lvl w:ilvl="0">
       <w:start w:val="1"/>
       <w:numFmt w:val="bullet"/>
@@ -16003,10 +15387,10 @@
       </w:rPr>
     </w:lvl>
   </w:abstractNum>
-  <w:abstractNum w:abstractNumId="6" w15:restartNumberingAfterBreak="0">
-    <w:nsid w:val="7A1124CA"/>
+  <w:abstractNum w:abstractNumId="1" w15:restartNumberingAfterBreak="0">
+    <w:nsid w:val="42FD18A6"/>
     <w:multiLevelType w:val="multilevel"/>
-    <w:tmpl w:val="2F4824DA"/>
+    <w:tmpl w:val="75801650"/>
     <w:lvl w:ilvl="0">
       <w:start w:val="1"/>
       <w:numFmt w:val="bullet"/>
@@ -16116,10 +15500,349 @@
       </w:rPr>
     </w:lvl>
   </w:abstractNum>
-  <w:abstractNum w:abstractNumId="7" w15:restartNumberingAfterBreak="0">
-    <w:nsid w:val="7B8565A3"/>
+  <w:abstractNum w:abstractNumId="2" w15:restartNumberingAfterBreak="0">
+    <w:nsid w:val="560E2888"/>
     <w:multiLevelType w:val="multilevel"/>
-    <w:tmpl w:val="45A42906"/>
+    <w:tmpl w:val="2C0C51E6"/>
+    <w:lvl w:ilvl="0">
+      <w:start w:val="1"/>
+      <w:numFmt w:val="bullet"/>
+      <w:lvlText w:val="●"/>
+      <w:lvlJc w:val="left"/>
+      <w:pPr>
+        <w:ind w:left="720" w:hanging="360"/>
+      </w:pPr>
+      <w:rPr>
+        <w:u w:val="none"/>
+      </w:rPr>
+    </w:lvl>
+    <w:lvl w:ilvl="1">
+      <w:start w:val="1"/>
+      <w:numFmt w:val="bullet"/>
+      <w:lvlText w:val="●"/>
+      <w:lvlJc w:val="left"/>
+      <w:pPr>
+        <w:ind w:left="1440" w:hanging="360"/>
+      </w:pPr>
+      <w:rPr>
+        <w:u w:val="none"/>
+      </w:rPr>
+    </w:lvl>
+    <w:lvl w:ilvl="2">
+      <w:start w:val="1"/>
+      <w:numFmt w:val="bullet"/>
+      <w:lvlText w:val="■"/>
+      <w:lvlJc w:val="left"/>
+      <w:pPr>
+        <w:ind w:left="2160" w:hanging="360"/>
+      </w:pPr>
+      <w:rPr>
+        <w:u w:val="none"/>
+      </w:rPr>
+    </w:lvl>
+    <w:lvl w:ilvl="3">
+      <w:start w:val="1"/>
+      <w:numFmt w:val="bullet"/>
+      <w:lvlText w:val="●"/>
+      <w:lvlJc w:val="left"/>
+      <w:pPr>
+        <w:ind w:left="2880" w:hanging="360"/>
+      </w:pPr>
+      <w:rPr>
+        <w:u w:val="none"/>
+      </w:rPr>
+    </w:lvl>
+    <w:lvl w:ilvl="4">
+      <w:start w:val="1"/>
+      <w:numFmt w:val="bullet"/>
+      <w:lvlText w:val="○"/>
+      <w:lvlJc w:val="left"/>
+      <w:pPr>
+        <w:ind w:left="3600" w:hanging="360"/>
+      </w:pPr>
+      <w:rPr>
+        <w:u w:val="none"/>
+      </w:rPr>
+    </w:lvl>
+    <w:lvl w:ilvl="5">
+      <w:start w:val="1"/>
+      <w:numFmt w:val="bullet"/>
+      <w:lvlText w:val="■"/>
+      <w:lvlJc w:val="left"/>
+      <w:pPr>
+        <w:ind w:left="4320" w:hanging="360"/>
+      </w:pPr>
+      <w:rPr>
+        <w:u w:val="none"/>
+      </w:rPr>
+    </w:lvl>
+    <w:lvl w:ilvl="6">
+      <w:start w:val="1"/>
+      <w:numFmt w:val="bullet"/>
+      <w:lvlText w:val="●"/>
+      <w:lvlJc w:val="left"/>
+      <w:pPr>
+        <w:ind w:left="5040" w:hanging="360"/>
+      </w:pPr>
+      <w:rPr>
+        <w:u w:val="none"/>
+      </w:rPr>
+    </w:lvl>
+    <w:lvl w:ilvl="7">
+      <w:start w:val="1"/>
+      <w:numFmt w:val="bullet"/>
+      <w:lvlText w:val="○"/>
+      <w:lvlJc w:val="left"/>
+      <w:pPr>
+        <w:ind w:left="5760" w:hanging="360"/>
+      </w:pPr>
+      <w:rPr>
+        <w:u w:val="none"/>
+      </w:rPr>
+    </w:lvl>
+    <w:lvl w:ilvl="8">
+      <w:start w:val="1"/>
+      <w:numFmt w:val="bullet"/>
+      <w:lvlText w:val="■"/>
+      <w:lvlJc w:val="left"/>
+      <w:pPr>
+        <w:ind w:left="6480" w:hanging="360"/>
+      </w:pPr>
+      <w:rPr>
+        <w:u w:val="none"/>
+      </w:rPr>
+    </w:lvl>
+  </w:abstractNum>
+  <w:abstractNum w:abstractNumId="3" w15:restartNumberingAfterBreak="0">
+    <w:nsid w:val="63F329A0"/>
+    <w:multiLevelType w:val="multilevel"/>
+    <w:tmpl w:val="0DD6328A"/>
+    <w:lvl w:ilvl="0">
+      <w:start w:val="1"/>
+      <w:numFmt w:val="bullet"/>
+      <w:lvlText w:val="●"/>
+      <w:lvlJc w:val="left"/>
+      <w:pPr>
+        <w:ind w:left="720" w:hanging="360"/>
+      </w:pPr>
+      <w:rPr>
+        <w:u w:val="none"/>
+      </w:rPr>
+    </w:lvl>
+    <w:lvl w:ilvl="1">
+      <w:start w:val="1"/>
+      <w:numFmt w:val="bullet"/>
+      <w:lvlText w:val="○"/>
+      <w:lvlJc w:val="left"/>
+      <w:pPr>
+        <w:ind w:left="1440" w:hanging="360"/>
+      </w:pPr>
+      <w:rPr>
+        <w:u w:val="none"/>
+      </w:rPr>
+    </w:lvl>
+    <w:lvl w:ilvl="2">
+      <w:start w:val="1"/>
+      <w:numFmt w:val="bullet"/>
+      <w:lvlText w:val="■"/>
+      <w:lvlJc w:val="left"/>
+      <w:pPr>
+        <w:ind w:left="2160" w:hanging="360"/>
+      </w:pPr>
+      <w:rPr>
+        <w:u w:val="none"/>
+      </w:rPr>
+    </w:lvl>
+    <w:lvl w:ilvl="3">
+      <w:start w:val="1"/>
+      <w:numFmt w:val="bullet"/>
+      <w:lvlText w:val="●"/>
+      <w:lvlJc w:val="left"/>
+      <w:pPr>
+        <w:ind w:left="2880" w:hanging="360"/>
+      </w:pPr>
+      <w:rPr>
+        <w:u w:val="none"/>
+      </w:rPr>
+    </w:lvl>
+    <w:lvl w:ilvl="4">
+      <w:start w:val="1"/>
+      <w:numFmt w:val="bullet"/>
+      <w:lvlText w:val="○"/>
+      <w:lvlJc w:val="left"/>
+      <w:pPr>
+        <w:ind w:left="3600" w:hanging="360"/>
+      </w:pPr>
+      <w:rPr>
+        <w:u w:val="none"/>
+      </w:rPr>
+    </w:lvl>
+    <w:lvl w:ilvl="5">
+      <w:start w:val="1"/>
+      <w:numFmt w:val="bullet"/>
+      <w:lvlText w:val="■"/>
+      <w:lvlJc w:val="left"/>
+      <w:pPr>
+        <w:ind w:left="4320" w:hanging="360"/>
+      </w:pPr>
+      <w:rPr>
+        <w:u w:val="none"/>
+      </w:rPr>
+    </w:lvl>
+    <w:lvl w:ilvl="6">
+      <w:start w:val="1"/>
+      <w:numFmt w:val="bullet"/>
+      <w:lvlText w:val="●"/>
+      <w:lvlJc w:val="left"/>
+      <w:pPr>
+        <w:ind w:left="5040" w:hanging="360"/>
+      </w:pPr>
+      <w:rPr>
+        <w:u w:val="none"/>
+      </w:rPr>
+    </w:lvl>
+    <w:lvl w:ilvl="7">
+      <w:start w:val="1"/>
+      <w:numFmt w:val="bullet"/>
+      <w:lvlText w:val="○"/>
+      <w:lvlJc w:val="left"/>
+      <w:pPr>
+        <w:ind w:left="5760" w:hanging="360"/>
+      </w:pPr>
+      <w:rPr>
+        <w:u w:val="none"/>
+      </w:rPr>
+    </w:lvl>
+    <w:lvl w:ilvl="8">
+      <w:start w:val="1"/>
+      <w:numFmt w:val="bullet"/>
+      <w:lvlText w:val="■"/>
+      <w:lvlJc w:val="left"/>
+      <w:pPr>
+        <w:ind w:left="6480" w:hanging="360"/>
+      </w:pPr>
+      <w:rPr>
+        <w:u w:val="none"/>
+      </w:rPr>
+    </w:lvl>
+  </w:abstractNum>
+  <w:abstractNum w:abstractNumId="4" w15:restartNumberingAfterBreak="0">
+    <w:nsid w:val="6C1F1ED5"/>
+    <w:multiLevelType w:val="multilevel"/>
+    <w:tmpl w:val="25102244"/>
+    <w:lvl w:ilvl="0">
+      <w:start w:val="1"/>
+      <w:numFmt w:val="bullet"/>
+      <w:lvlText w:val="●"/>
+      <w:lvlJc w:val="left"/>
+      <w:pPr>
+        <w:ind w:left="720" w:hanging="360"/>
+      </w:pPr>
+      <w:rPr>
+        <w:u w:val="none"/>
+      </w:rPr>
+    </w:lvl>
+    <w:lvl w:ilvl="1">
+      <w:start w:val="1"/>
+      <w:numFmt w:val="bullet"/>
+      <w:lvlText w:val="○"/>
+      <w:lvlJc w:val="left"/>
+      <w:pPr>
+        <w:ind w:left="1440" w:hanging="360"/>
+      </w:pPr>
+      <w:rPr>
+        <w:u w:val="none"/>
+      </w:rPr>
+    </w:lvl>
+    <w:lvl w:ilvl="2">
+      <w:start w:val="1"/>
+      <w:numFmt w:val="bullet"/>
+      <w:lvlText w:val="■"/>
+      <w:lvlJc w:val="left"/>
+      <w:pPr>
+        <w:ind w:left="2160" w:hanging="360"/>
+      </w:pPr>
+      <w:rPr>
+        <w:u w:val="none"/>
+      </w:rPr>
+    </w:lvl>
+    <w:lvl w:ilvl="3">
+      <w:start w:val="1"/>
+      <w:numFmt w:val="bullet"/>
+      <w:lvlText w:val="●"/>
+      <w:lvlJc w:val="left"/>
+      <w:pPr>
+        <w:ind w:left="2880" w:hanging="360"/>
+      </w:pPr>
+      <w:rPr>
+        <w:u w:val="none"/>
+      </w:rPr>
+    </w:lvl>
+    <w:lvl w:ilvl="4">
+      <w:start w:val="1"/>
+      <w:numFmt w:val="bullet"/>
+      <w:lvlText w:val="○"/>
+      <w:lvlJc w:val="left"/>
+      <w:pPr>
+        <w:ind w:left="3600" w:hanging="360"/>
+      </w:pPr>
+      <w:rPr>
+        <w:u w:val="none"/>
+      </w:rPr>
+    </w:lvl>
+    <w:lvl w:ilvl="5">
+      <w:start w:val="1"/>
+      <w:numFmt w:val="bullet"/>
+      <w:lvlText w:val="■"/>
+      <w:lvlJc w:val="left"/>
+      <w:pPr>
+        <w:ind w:left="4320" w:hanging="360"/>
+      </w:pPr>
+      <w:rPr>
+        <w:u w:val="none"/>
+      </w:rPr>
+    </w:lvl>
+    <w:lvl w:ilvl="6">
+      <w:start w:val="1"/>
+      <w:numFmt w:val="bullet"/>
+      <w:lvlText w:val="●"/>
+      <w:lvlJc w:val="left"/>
+      <w:pPr>
+        <w:ind w:left="5040" w:hanging="360"/>
+      </w:pPr>
+      <w:rPr>
+        <w:u w:val="none"/>
+      </w:rPr>
+    </w:lvl>
+    <w:lvl w:ilvl="7">
+      <w:start w:val="1"/>
+      <w:numFmt w:val="bullet"/>
+      <w:lvlText w:val="○"/>
+      <w:lvlJc w:val="left"/>
+      <w:pPr>
+        <w:ind w:left="5760" w:hanging="360"/>
+      </w:pPr>
+      <w:rPr>
+        <w:u w:val="none"/>
+      </w:rPr>
+    </w:lvl>
+    <w:lvl w:ilvl="8">
+      <w:start w:val="1"/>
+      <w:numFmt w:val="bullet"/>
+      <w:lvlText w:val="■"/>
+      <w:lvlJc w:val="left"/>
+      <w:pPr>
+        <w:ind w:left="6480" w:hanging="360"/>
+      </w:pPr>
+      <w:rPr>
+        <w:u w:val="none"/>
+      </w:rPr>
+    </w:lvl>
+  </w:abstractNum>
+  <w:abstractNum w:abstractNumId="5" w15:restartNumberingAfterBreak="0">
+    <w:nsid w:val="6C7E67F0"/>
+    <w:multiLevelType w:val="multilevel"/>
+    <w:tmpl w:val="7EEA78D8"/>
     <w:lvl w:ilvl="0">
       <w:start w:val="1"/>
       <w:numFmt w:val="bullet"/>
@@ -16238,28 +15961,254 @@
       </w:rPr>
     </w:lvl>
   </w:abstractNum>
-  <w:num w:numId="1" w16cid:durableId="1256548445">
+  <w:abstractNum w:abstractNumId="6" w15:restartNumberingAfterBreak="0">
+    <w:nsid w:val="6EC07D38"/>
+    <w:multiLevelType w:val="multilevel"/>
+    <w:tmpl w:val="55A4078E"/>
+    <w:lvl w:ilvl="0">
+      <w:start w:val="1"/>
+      <w:numFmt w:val="bullet"/>
+      <w:lvlText w:val="●"/>
+      <w:lvlJc w:val="left"/>
+      <w:pPr>
+        <w:ind w:left="720" w:hanging="360"/>
+      </w:pPr>
+      <w:rPr>
+        <w:u w:val="none"/>
+      </w:rPr>
+    </w:lvl>
+    <w:lvl w:ilvl="1">
+      <w:start w:val="1"/>
+      <w:numFmt w:val="bullet"/>
+      <w:lvlText w:val="○"/>
+      <w:lvlJc w:val="left"/>
+      <w:pPr>
+        <w:ind w:left="1440" w:hanging="360"/>
+      </w:pPr>
+      <w:rPr>
+        <w:u w:val="none"/>
+      </w:rPr>
+    </w:lvl>
+    <w:lvl w:ilvl="2">
+      <w:start w:val="1"/>
+      <w:numFmt w:val="bullet"/>
+      <w:lvlText w:val="■"/>
+      <w:lvlJc w:val="left"/>
+      <w:pPr>
+        <w:ind w:left="2160" w:hanging="360"/>
+      </w:pPr>
+      <w:rPr>
+        <w:u w:val="none"/>
+      </w:rPr>
+    </w:lvl>
+    <w:lvl w:ilvl="3">
+      <w:start w:val="1"/>
+      <w:numFmt w:val="bullet"/>
+      <w:lvlText w:val="●"/>
+      <w:lvlJc w:val="left"/>
+      <w:pPr>
+        <w:ind w:left="2880" w:hanging="360"/>
+      </w:pPr>
+      <w:rPr>
+        <w:u w:val="none"/>
+      </w:rPr>
+    </w:lvl>
+    <w:lvl w:ilvl="4">
+      <w:start w:val="1"/>
+      <w:numFmt w:val="bullet"/>
+      <w:lvlText w:val="○"/>
+      <w:lvlJc w:val="left"/>
+      <w:pPr>
+        <w:ind w:left="3600" w:hanging="360"/>
+      </w:pPr>
+      <w:rPr>
+        <w:u w:val="none"/>
+      </w:rPr>
+    </w:lvl>
+    <w:lvl w:ilvl="5">
+      <w:start w:val="1"/>
+      <w:numFmt w:val="bullet"/>
+      <w:lvlText w:val="■"/>
+      <w:lvlJc w:val="left"/>
+      <w:pPr>
+        <w:ind w:left="4320" w:hanging="360"/>
+      </w:pPr>
+      <w:rPr>
+        <w:u w:val="none"/>
+      </w:rPr>
+    </w:lvl>
+    <w:lvl w:ilvl="6">
+      <w:start w:val="1"/>
+      <w:numFmt w:val="bullet"/>
+      <w:lvlText w:val="●"/>
+      <w:lvlJc w:val="left"/>
+      <w:pPr>
+        <w:ind w:left="5040" w:hanging="360"/>
+      </w:pPr>
+      <w:rPr>
+        <w:u w:val="none"/>
+      </w:rPr>
+    </w:lvl>
+    <w:lvl w:ilvl="7">
+      <w:start w:val="1"/>
+      <w:numFmt w:val="bullet"/>
+      <w:lvlText w:val="○"/>
+      <w:lvlJc w:val="left"/>
+      <w:pPr>
+        <w:ind w:left="5760" w:hanging="360"/>
+      </w:pPr>
+      <w:rPr>
+        <w:u w:val="none"/>
+      </w:rPr>
+    </w:lvl>
+    <w:lvl w:ilvl="8">
+      <w:start w:val="1"/>
+      <w:numFmt w:val="bullet"/>
+      <w:lvlText w:val="■"/>
+      <w:lvlJc w:val="left"/>
+      <w:pPr>
+        <w:ind w:left="6480" w:hanging="360"/>
+      </w:pPr>
+      <w:rPr>
+        <w:u w:val="none"/>
+      </w:rPr>
+    </w:lvl>
+  </w:abstractNum>
+  <w:abstractNum w:abstractNumId="7" w15:restartNumberingAfterBreak="0">
+    <w:nsid w:val="76D77979"/>
+    <w:multiLevelType w:val="multilevel"/>
+    <w:tmpl w:val="E2ECFD06"/>
+    <w:lvl w:ilvl="0">
+      <w:start w:val="1"/>
+      <w:numFmt w:val="decimal"/>
+      <w:lvlText w:val="%1."/>
+      <w:lvlJc w:val="left"/>
+      <w:pPr>
+        <w:ind w:left="720" w:hanging="360"/>
+      </w:pPr>
+      <w:rPr>
+        <w:u w:val="none"/>
+      </w:rPr>
+    </w:lvl>
+    <w:lvl w:ilvl="1">
+      <w:start w:val="1"/>
+      <w:numFmt w:val="lowerLetter"/>
+      <w:lvlText w:val="%2."/>
+      <w:lvlJc w:val="left"/>
+      <w:pPr>
+        <w:ind w:left="1440" w:hanging="360"/>
+      </w:pPr>
+      <w:rPr>
+        <w:u w:val="none"/>
+      </w:rPr>
+    </w:lvl>
+    <w:lvl w:ilvl="2">
+      <w:start w:val="1"/>
+      <w:numFmt w:val="lowerRoman"/>
+      <w:lvlText w:val="%3."/>
+      <w:lvlJc w:val="right"/>
+      <w:pPr>
+        <w:ind w:left="2160" w:hanging="360"/>
+      </w:pPr>
+      <w:rPr>
+        <w:u w:val="none"/>
+      </w:rPr>
+    </w:lvl>
+    <w:lvl w:ilvl="3">
+      <w:start w:val="1"/>
+      <w:numFmt w:val="decimal"/>
+      <w:lvlText w:val="%4."/>
+      <w:lvlJc w:val="left"/>
+      <w:pPr>
+        <w:ind w:left="2880" w:hanging="360"/>
+      </w:pPr>
+      <w:rPr>
+        <w:u w:val="none"/>
+      </w:rPr>
+    </w:lvl>
+    <w:lvl w:ilvl="4">
+      <w:start w:val="1"/>
+      <w:numFmt w:val="lowerLetter"/>
+      <w:lvlText w:val="%5."/>
+      <w:lvlJc w:val="left"/>
+      <w:pPr>
+        <w:ind w:left="3600" w:hanging="360"/>
+      </w:pPr>
+      <w:rPr>
+        <w:u w:val="none"/>
+      </w:rPr>
+    </w:lvl>
+    <w:lvl w:ilvl="5">
+      <w:start w:val="1"/>
+      <w:numFmt w:val="lowerRoman"/>
+      <w:lvlText w:val="%6."/>
+      <w:lvlJc w:val="right"/>
+      <w:pPr>
+        <w:ind w:left="4320" w:hanging="360"/>
+      </w:pPr>
+      <w:rPr>
+        <w:u w:val="none"/>
+      </w:rPr>
+    </w:lvl>
+    <w:lvl w:ilvl="6">
+      <w:start w:val="1"/>
+      <w:numFmt w:val="decimal"/>
+      <w:lvlText w:val="%7."/>
+      <w:lvlJc w:val="left"/>
+      <w:pPr>
+        <w:ind w:left="5040" w:hanging="360"/>
+      </w:pPr>
+      <w:rPr>
+        <w:u w:val="none"/>
+      </w:rPr>
+    </w:lvl>
+    <w:lvl w:ilvl="7">
+      <w:start w:val="1"/>
+      <w:numFmt w:val="lowerLetter"/>
+      <w:lvlText w:val="%8."/>
+      <w:lvlJc w:val="left"/>
+      <w:pPr>
+        <w:ind w:left="5760" w:hanging="360"/>
+      </w:pPr>
+      <w:rPr>
+        <w:u w:val="none"/>
+      </w:rPr>
+    </w:lvl>
+    <w:lvl w:ilvl="8">
+      <w:start w:val="1"/>
+      <w:numFmt w:val="lowerRoman"/>
+      <w:lvlText w:val="%9."/>
+      <w:lvlJc w:val="right"/>
+      <w:pPr>
+        <w:ind w:left="6480" w:hanging="360"/>
+      </w:pPr>
+      <w:rPr>
+        <w:u w:val="none"/>
+      </w:rPr>
+    </w:lvl>
+  </w:abstractNum>
+  <w:num w:numId="1" w16cid:durableId="1759133627">
+    <w:abstractNumId w:val="0"/>
+  </w:num>
+  <w:num w:numId="2" w16cid:durableId="476267007">
+    <w:abstractNumId w:val="4"/>
+  </w:num>
+  <w:num w:numId="3" w16cid:durableId="782723102">
+    <w:abstractNumId w:val="1"/>
+  </w:num>
+  <w:num w:numId="4" w16cid:durableId="1417439554">
+    <w:abstractNumId w:val="2"/>
+  </w:num>
+  <w:num w:numId="5" w16cid:durableId="115762932">
+    <w:abstractNumId w:val="5"/>
+  </w:num>
+  <w:num w:numId="6" w16cid:durableId="1990816648">
     <w:abstractNumId w:val="7"/>
   </w:num>
-  <w:num w:numId="2" w16cid:durableId="354767778">
-    <w:abstractNumId w:val="0"/>
-  </w:num>
-  <w:num w:numId="3" w16cid:durableId="1635864279">
-    <w:abstractNumId w:val="2"/>
-  </w:num>
-  <w:num w:numId="4" w16cid:durableId="129784415">
-    <w:abstractNumId w:val="4"/>
-  </w:num>
-  <w:num w:numId="5" w16cid:durableId="392776067">
-    <w:abstractNumId w:val="5"/>
-  </w:num>
-  <w:num w:numId="6" w16cid:durableId="123274663">
-    <w:abstractNumId w:val="1"/>
-  </w:num>
-  <w:num w:numId="7" w16cid:durableId="1854343473">
+  <w:num w:numId="7" w16cid:durableId="524900433">
     <w:abstractNumId w:val="6"/>
   </w:num>
-  <w:num w:numId="8" w16cid:durableId="60491178">
+  <w:num w:numId="8" w16cid:durableId="2020962457">
     <w:abstractNumId w:val="3"/>
   </w:num>
 </w:numbering>

</xml_diff>